<commit_message>
chore(tests): regenerate reference docs and extract XML
- Fix multiline string syntax in code_blocks generator
- Regenerate all 8 DOCX files (minimal, styled, headings, tables, lists, code_blocks, images, layout)
- Regenerate all 8 PPTX files (minimal, content, styled, table, image, charts, notes, two_column)
- Extract XML from all 16 reference docs into tests/fixtures/expected_xml/
- Mark unzip and XML extraction tasks complete in TODO
</commit_message>
<xml_diff>
--- a/tests/fixtures/reference_docs/styled.docx
+++ b/tests/fixtures/reference_docs/styled.docx
@@ -243,10 +243,73 @@
     <w:p>
       <w:r>
         <w:rPr>
-          <w:color w:val="0000FF"/>
+          <w:strike/>
         </w:rPr>
-        <w:t>Click here</w:t>
+        <w:t>Strikethrough text</w:t>
       </w:r>
+    </w:p>
+    <w:p>
+      <w:r>
+        <w:t>E = mc</w:t>
+      </w:r>
+      <w:r>
+        <w:rPr>
+          <w:vertAlign w:val="superscript"/>
+        </w:rPr>
+        <w:t>2</w:t>
+      </w:r>
+    </w:p>
+    <w:p>
+      <w:r>
+        <w:t>H</w:t>
+      </w:r>
+      <w:r>
+        <w:rPr>
+          <w:vertAlign w:val="subscript"/>
+        </w:rPr>
+        <w:t>2</w:t>
+      </w:r>
+      <w:r>
+        <w:t>O</w:t>
+      </w:r>
+    </w:p>
+    <w:p>
+      <w:r>
+        <w:rPr>
+          <w:rFonts w:ascii="Arial" w:hAnsi="Arial"/>
+        </w:rPr>
+        <w:t>Arial font</w:t>
+      </w:r>
+    </w:p>
+    <w:p>
+      <w:r>
+        <w:rPr>
+          <w:rFonts w:ascii="Times New Roman" w:hAnsi="Times New Roman"/>
+        </w:rPr>
+        <w:t>Times New Roman font</w:t>
+      </w:r>
+    </w:p>
+    <w:p>
+      <w:r>
+        <w:rPr>
+          <w:rFonts w:ascii="Courier New" w:hAnsi="Courier New"/>
+        </w:rPr>
+        <w:t>Courier New font</w:t>
+      </w:r>
+    </w:p>
+    <w:p>
+      <w:r>
+        <w:t xml:space="preserve">Visit: </w:t>
+      </w:r>
+      <w:hyperlink r:id="rId9">
+        <w:r>
+          <w:rPr>
+            <w:color w:val="0563C1"/>
+            <w:u w:val="single"/>
+          </w:rPr>
+          <w:t>Example Website</w:t>
+        </w:r>
+      </w:hyperlink>
     </w:p>
     <w:sectPr>
       <w:pgSz w:w="12240" w:h="15840"/>

</xml_diff>